<commit_message>
Added topic edit & delete
</commit_message>
<xml_diff>
--- a/docs/SocialNEURON_MCA401_Report.docx
+++ b/docs/SocialNEURON_MCA401_Report.docx
@@ -3322,6 +3322,76 @@
           <w:tcPr>
             <w:tcW w:w="1992" w:type="dxa"/>
             <w:tcBorders>
+              <w:left w:val="single" w:sz="2" w:space="0" w:color="AAAAAA"/>
+              <w:bottom w:val="single" w:sz="2" w:space="0" w:color="AAAAAA"/>
+              <w:right w:val="single" w:sz="2" w:space="0" w:color="AAAAAA"/>
+            </w:tcBorders>
+            <w:shd w:color="auto" w:fill="EEF4FB" w:val="clear"/>
+          </w:tcPr>
+          <w:p>
+            <w:pPr>
+              <w:pStyle w:val="Normal"/>
+              <w:widowControl w:val="false"/>
+              <w:rPr/>
+            </w:pPr>
+            <w:r>
+              <w:rPr/>
+              <w:t>3.6</w:t>
+            </w:r>
+          </w:p>
+        </w:tc>
+        <w:tc>
+          <w:tcPr>
+            <w:tcW w:w="5495" w:type="dxa"/>
+            <w:tcBorders>
+              <w:left w:val="single" w:sz="2" w:space="0" w:color="AAAAAA"/>
+              <w:bottom w:val="single" w:sz="2" w:space="0" w:color="AAAAAA"/>
+              <w:right w:val="single" w:sz="2" w:space="0" w:color="AAAAAA"/>
+            </w:tcBorders>
+            <w:shd w:color="auto" w:fill="EEF4FB" w:val="clear"/>
+          </w:tcPr>
+          <w:p>
+            <w:pPr>
+              <w:pStyle w:val="Normal"/>
+              <w:widowControl w:val="false"/>
+              <w:rPr/>
+            </w:pPr>
+            <w:r>
+              <w:rPr/>
+              <w:t>Sequence Diagram</w:t>
+            </w:r>
+          </w:p>
+        </w:tc>
+        <w:tc>
+          <w:tcPr>
+            <w:tcW w:w="1527" w:type="dxa"/>
+            <w:tcBorders>
+              <w:left w:val="single" w:sz="2" w:space="0" w:color="AAAAAA"/>
+              <w:bottom w:val="single" w:sz="2" w:space="0" w:color="AAAAAA"/>
+              <w:right w:val="single" w:sz="2" w:space="0" w:color="AAAAAA"/>
+            </w:tcBorders>
+            <w:shd w:color="auto" w:fill="EEF4FB" w:val="clear"/>
+          </w:tcPr>
+          <w:p>
+            <w:pPr>
+              <w:pStyle w:val="Normal"/>
+              <w:widowControl w:val="false"/>
+              <w:rPr/>
+            </w:pPr>
+            <w:r>
+              <w:rPr/>
+            </w:r>
+          </w:p>
+        </w:tc>
+      </w:tr>
+      <w:tr>
+        <w:trPr>
+          <w:trHeight w:val="279" w:hRule="atLeast"/>
+        </w:trPr>
+        <w:tc>
+          <w:tcPr>
+            <w:tcW w:w="1992" w:type="dxa"/>
+            <w:tcBorders>
               <w:top w:val="single" w:sz="2" w:space="0" w:color="AAAAAA"/>
               <w:left w:val="single" w:sz="2" w:space="0" w:color="AAAAAA"/>
               <w:bottom w:val="single" w:sz="2" w:space="0" w:color="AAAAAA"/>
@@ -3340,7 +3410,7 @@
                 <w:sz w:val="22"/>
                 <w:szCs w:val="22"/>
               </w:rPr>
-              <w:t>3.6</w:t>
+              <w:t>3.7</w:t>
             </w:r>
           </w:p>
         </w:tc>
@@ -8574,7 +8644,7 @@
       <w:r>
         <w:rPr/>
         <w:drawing>
-          <wp:anchor behindDoc="0" distT="0" distB="0" distL="0" distR="0" simplePos="0" locked="0" layoutInCell="0" allowOverlap="1" relativeHeight="21">
+          <wp:anchor behindDoc="0" distT="0" distB="0" distL="0" distR="0" simplePos="0" locked="0" layoutInCell="0" allowOverlap="1" relativeHeight="14">
             <wp:simplePos x="0" y="0"/>
             <wp:positionH relativeFrom="column">
               <wp:align>center</wp:align>
@@ -8760,7 +8830,7 @@
           <w:szCs w:val="28"/>
         </w:rPr>
         <w:drawing>
-          <wp:anchor behindDoc="0" distT="0" distB="0" distL="0" distR="0" simplePos="0" locked="0" layoutInCell="0" allowOverlap="1" relativeHeight="23">
+          <wp:anchor behindDoc="0" distT="0" distB="0" distL="0" distR="0" simplePos="0" locked="0" layoutInCell="0" allowOverlap="1" relativeHeight="16">
             <wp:simplePos x="0" y="0"/>
             <wp:positionH relativeFrom="column">
               <wp:align>center</wp:align>
@@ -9697,7 +9767,7 @@
           <w:szCs w:val="28"/>
         </w:rPr>
         <w:drawing>
-          <wp:anchor behindDoc="0" distT="0" distB="0" distL="0" distR="0" simplePos="0" locked="0" layoutInCell="0" allowOverlap="1" relativeHeight="24">
+          <wp:anchor behindDoc="0" distT="0" distB="0" distL="0" distR="0" simplePos="0" locked="0" layoutInCell="0" allowOverlap="1" relativeHeight="17">
             <wp:simplePos x="0" y="0"/>
             <wp:positionH relativeFrom="column">
               <wp:align>center</wp:align>
@@ -9938,7 +10008,7 @@
           <w:szCs w:val="28"/>
         </w:rPr>
         <w:drawing>
-          <wp:anchor behindDoc="0" distT="0" distB="0" distL="0" distR="0" simplePos="0" locked="0" layoutInCell="0" allowOverlap="1" relativeHeight="25">
+          <wp:anchor behindDoc="0" distT="0" distB="0" distL="0" distR="0" simplePos="0" locked="0" layoutInCell="0" allowOverlap="1" relativeHeight="18">
             <wp:simplePos x="0" y="0"/>
             <wp:positionH relativeFrom="column">
               <wp:posOffset>-384175</wp:posOffset>
@@ -10265,7 +10335,7 @@
           <w:szCs w:val="28"/>
         </w:rPr>
         <w:drawing>
-          <wp:anchor behindDoc="0" distT="0" distB="0" distL="0" distR="0" simplePos="0" locked="0" layoutInCell="0" allowOverlap="1" relativeHeight="26">
+          <wp:anchor behindDoc="0" distT="0" distB="0" distL="0" distR="0" simplePos="0" locked="0" layoutInCell="0" allowOverlap="1" relativeHeight="19">
             <wp:simplePos x="0" y="0"/>
             <wp:positionH relativeFrom="column">
               <wp:posOffset>-370840</wp:posOffset>
@@ -10537,7 +10607,7 @@
           <w:szCs w:val="28"/>
         </w:rPr>
         <w:drawing>
-          <wp:anchor behindDoc="0" distT="0" distB="0" distL="0" distR="0" simplePos="0" locked="0" layoutInCell="0" allowOverlap="1" relativeHeight="27">
+          <wp:anchor behindDoc="0" distT="0" distB="0" distL="0" distR="0" simplePos="0" locked="0" layoutInCell="0" allowOverlap="1" relativeHeight="20">
             <wp:simplePos x="0" y="0"/>
             <wp:positionH relativeFrom="column">
               <wp:posOffset>-313690</wp:posOffset>
@@ -14712,44 +14782,16 @@
           <w:sz w:val="22"/>
           <w:szCs w:val="22"/>
         </w:rPr>
-      </w:r>
-    </w:p>
-    <w:p>
-      <w:pPr>
-        <w:pStyle w:val="Normal"/>
-        <w:pBdr>
-          <w:top w:val="single" w:sz="2" w:space="0" w:color="CCCCCC"/>
-          <w:bottom w:val="single" w:sz="2" w:space="0" w:color="CCCCCC"/>
-        </w:pBdr>
-        <w:spacing w:before="200" w:after="100"/>
-        <w:jc w:val="center"/>
-        <w:rPr>
-          <w:i/>
-          <w:i/>
-          <w:iCs/>
-          <w:color w:val="555555"/>
-          <w:sz w:val="22"/>
-          <w:szCs w:val="22"/>
-        </w:rPr>
-      </w:pPr>
-      <w:r>
-        <w:rPr>
-          <w:i/>
-          <w:iCs/>
-          <w:color w:val="555555"/>
-          <w:sz w:val="22"/>
-          <w:szCs w:val="22"/>
-        </w:rPr>
         <w:drawing>
-          <wp:anchor behindDoc="0" distT="0" distB="0" distL="0" distR="0" simplePos="0" locked="0" layoutInCell="0" allowOverlap="1" relativeHeight="12">
+          <wp:anchor behindDoc="0" distT="0" distB="0" distL="0" distR="0" simplePos="0" locked="0" layoutInCell="0" allowOverlap="1" relativeHeight="22">
             <wp:simplePos x="0" y="0"/>
             <wp:positionH relativeFrom="column">
-              <wp:align>center</wp:align>
+              <wp:posOffset>-472440</wp:posOffset>
             </wp:positionH>
             <wp:positionV relativeFrom="paragraph">
               <wp:posOffset>635</wp:posOffset>
             </wp:positionV>
-            <wp:extent cx="6232525" cy="2571750"/>
+            <wp:extent cx="6306820" cy="2616200"/>
             <wp:effectExtent l="0" t="0" r="0" b="0"/>
             <wp:wrapSquare wrapText="largest"/>
             <wp:docPr id="17" name="Image11" descr=""/>
@@ -14774,7 +14816,7 @@
                   <pic:spPr bwMode="auto">
                     <a:xfrm>
                       <a:off x="0" y="0"/>
-                      <a:ext cx="6232525" cy="2571750"/>
+                      <a:ext cx="6306820" cy="2616200"/>
                     </a:xfrm>
                     <a:prstGeom prst="rect">
                       <a:avLst/>
@@ -14796,17 +14838,23 @@
         </w:pBdr>
         <w:spacing w:before="200" w:after="100"/>
         <w:jc w:val="center"/>
-        <w:rPr/>
-      </w:pPr>
-      <w:r>
-        <w:rPr>
+        <w:rPr>
+          <w:i/>
           <w:i/>
           <w:iCs/>
           <w:color w:val="555555"/>
           <w:sz w:val="22"/>
           <w:szCs w:val="22"/>
         </w:rPr>
-        <w:t>[Figure 5.5: Dashboard]</w:t>
+      </w:pPr>
+      <w:r>
+        <w:rPr>
+          <w:i/>
+          <w:iCs/>
+          <w:color w:val="555555"/>
+          <w:sz w:val="22"/>
+          <w:szCs w:val="22"/>
+        </w:rPr>
       </w:r>
     </w:p>
     <w:p>
@@ -14818,23 +14866,17 @@
         </w:pBdr>
         <w:spacing w:before="200" w:after="100"/>
         <w:jc w:val="center"/>
-        <w:rPr>
-          <w:i/>
+        <w:rPr/>
+      </w:pPr>
+      <w:r>
+        <w:rPr>
           <w:i/>
           <w:iCs/>
           <w:color w:val="555555"/>
           <w:sz w:val="22"/>
           <w:szCs w:val="22"/>
         </w:rPr>
-      </w:pPr>
-      <w:r>
-        <w:rPr>
-          <w:i/>
-          <w:iCs/>
-          <w:color w:val="555555"/>
-          <w:sz w:val="22"/>
-          <w:szCs w:val="22"/>
-        </w:rPr>
+        <w:t>[Figure 5.5: Dashboard]</w:t>
       </w:r>
     </w:p>
     <w:p>
@@ -15032,15 +15074,15 @@
           <w:szCs w:val="22"/>
         </w:rPr>
         <w:drawing>
-          <wp:anchor behindDoc="0" distT="0" distB="0" distL="0" distR="0" simplePos="0" locked="0" layoutInCell="0" allowOverlap="1" relativeHeight="13">
+          <wp:anchor behindDoc="0" distT="0" distB="0" distL="0" distR="0" simplePos="0" locked="0" layoutInCell="0" allowOverlap="1" relativeHeight="23">
             <wp:simplePos x="0" y="0"/>
             <wp:positionH relativeFrom="column">
-              <wp:align>center</wp:align>
+              <wp:posOffset>-563880</wp:posOffset>
             </wp:positionH>
             <wp:positionV relativeFrom="paragraph">
-              <wp:posOffset>635</wp:posOffset>
+              <wp:posOffset>76200</wp:posOffset>
             </wp:positionV>
-            <wp:extent cx="6467475" cy="2668905"/>
+            <wp:extent cx="6356985" cy="2637155"/>
             <wp:effectExtent l="0" t="0" r="0" b="0"/>
             <wp:wrapSquare wrapText="largest"/>
             <wp:docPr id="18" name="Image12" descr=""/>
@@ -15065,7 +15107,7 @@
                   <pic:spPr bwMode="auto">
                     <a:xfrm>
                       <a:off x="0" y="0"/>
-                      <a:ext cx="6467475" cy="2668905"/>
+                      <a:ext cx="6356985" cy="2637155"/>
                     </a:xfrm>
                     <a:prstGeom prst="rect">
                       <a:avLst/>
@@ -15087,17 +15129,23 @@
         </w:pBdr>
         <w:spacing w:before="200" w:after="100"/>
         <w:jc w:val="center"/>
-        <w:rPr/>
-      </w:pPr>
-      <w:r>
-        <w:rPr>
+        <w:rPr>
+          <w:i/>
           <w:i/>
           <w:iCs/>
           <w:color w:val="555555"/>
           <w:sz w:val="22"/>
           <w:szCs w:val="22"/>
         </w:rPr>
-        <w:t>[Figure 5.6: Topic Generator]</w:t>
+      </w:pPr>
+      <w:r>
+        <w:rPr>
+          <w:i/>
+          <w:iCs/>
+          <w:color w:val="555555"/>
+          <w:sz w:val="22"/>
+          <w:szCs w:val="22"/>
+        </w:rPr>
       </w:r>
     </w:p>
     <w:p>
@@ -15109,23 +15157,17 @@
         </w:pBdr>
         <w:spacing w:before="200" w:after="100"/>
         <w:jc w:val="center"/>
-        <w:rPr>
-          <w:i/>
+        <w:rPr/>
+      </w:pPr>
+      <w:r>
+        <w:rPr>
           <w:i/>
           <w:iCs/>
           <w:color w:val="555555"/>
           <w:sz w:val="22"/>
           <w:szCs w:val="22"/>
         </w:rPr>
-      </w:pPr>
-      <w:r>
-        <w:rPr>
-          <w:i/>
-          <w:iCs/>
-          <w:color w:val="555555"/>
-          <w:sz w:val="22"/>
-          <w:szCs w:val="22"/>
-        </w:rPr>
+        <w:t>[Figure 5.6: Topic Generator]</w:t>
       </w:r>
     </w:p>
     <w:p>
@@ -15182,44 +15224,16 @@
           <w:sz w:val="22"/>
           <w:szCs w:val="22"/>
         </w:rPr>
-      </w:r>
-    </w:p>
-    <w:p>
-      <w:pPr>
-        <w:pStyle w:val="Normal"/>
-        <w:pBdr>
-          <w:top w:val="single" w:sz="2" w:space="0" w:color="CCCCCC"/>
-          <w:bottom w:val="single" w:sz="2" w:space="0" w:color="CCCCCC"/>
-        </w:pBdr>
-        <w:spacing w:before="200" w:after="100"/>
-        <w:jc w:val="center"/>
-        <w:rPr>
-          <w:i/>
-          <w:i/>
-          <w:iCs/>
-          <w:color w:val="555555"/>
-          <w:sz w:val="22"/>
-          <w:szCs w:val="22"/>
-        </w:rPr>
-      </w:pPr>
-      <w:r>
-        <w:rPr>
-          <w:i/>
-          <w:iCs/>
-          <w:color w:val="555555"/>
-          <w:sz w:val="22"/>
-          <w:szCs w:val="22"/>
-        </w:rPr>
         <w:drawing>
-          <wp:anchor behindDoc="0" distT="0" distB="0" distL="0" distR="0" simplePos="0" locked="0" layoutInCell="0" allowOverlap="1" relativeHeight="14">
+          <wp:anchor behindDoc="0" distT="0" distB="0" distL="0" distR="0" simplePos="0" locked="0" layoutInCell="0" allowOverlap="1" relativeHeight="24">
             <wp:simplePos x="0" y="0"/>
             <wp:positionH relativeFrom="column">
-              <wp:align>center</wp:align>
+              <wp:posOffset>-490855</wp:posOffset>
             </wp:positionH>
             <wp:positionV relativeFrom="paragraph">
-              <wp:posOffset>635</wp:posOffset>
+              <wp:posOffset>200025</wp:posOffset>
             </wp:positionV>
-            <wp:extent cx="6346825" cy="2618740"/>
+            <wp:extent cx="6381750" cy="2647315"/>
             <wp:effectExtent l="0" t="0" r="0" b="0"/>
             <wp:wrapSquare wrapText="largest"/>
             <wp:docPr id="19" name="Image13" descr=""/>
@@ -15244,7 +15258,7 @@
                   <pic:spPr bwMode="auto">
                     <a:xfrm>
                       <a:off x="0" y="0"/>
-                      <a:ext cx="6346825" cy="2618740"/>
+                      <a:ext cx="6381750" cy="2647315"/>
                     </a:xfrm>
                     <a:prstGeom prst="rect">
                       <a:avLst/>
@@ -15266,17 +15280,23 @@
         </w:pBdr>
         <w:spacing w:before="200" w:after="100"/>
         <w:jc w:val="center"/>
-        <w:rPr/>
-      </w:pPr>
-      <w:r>
-        <w:rPr>
+        <w:rPr>
+          <w:i/>
           <w:i/>
           <w:iCs/>
           <w:color w:val="555555"/>
           <w:sz w:val="22"/>
           <w:szCs w:val="22"/>
         </w:rPr>
-        <w:t>[Figure 5.7: Upload Content Schedule]</w:t>
+      </w:pPr>
+      <w:r>
+        <w:rPr>
+          <w:i/>
+          <w:iCs/>
+          <w:color w:val="555555"/>
+          <w:sz w:val="22"/>
+          <w:szCs w:val="22"/>
+        </w:rPr>
       </w:r>
     </w:p>
     <w:p>
@@ -15316,23 +15336,17 @@
         </w:pBdr>
         <w:spacing w:before="200" w:after="100"/>
         <w:jc w:val="center"/>
-        <w:rPr>
-          <w:i/>
+        <w:rPr/>
+      </w:pPr>
+      <w:r>
+        <w:rPr>
           <w:i/>
           <w:iCs/>
           <w:color w:val="555555"/>
           <w:sz w:val="22"/>
           <w:szCs w:val="22"/>
         </w:rPr>
-      </w:pPr>
-      <w:r>
-        <w:rPr>
-          <w:i/>
-          <w:iCs/>
-          <w:color w:val="555555"/>
-          <w:sz w:val="22"/>
-          <w:szCs w:val="22"/>
-        </w:rPr>
+        <w:t>[Figure 5.7: Upload Content Schedule]</w:t>
       </w:r>
     </w:p>
     <w:p>
@@ -15389,19 +15403,47 @@
           <w:sz w:val="22"/>
           <w:szCs w:val="22"/>
         </w:rPr>
+      </w:r>
+    </w:p>
+    <w:p>
+      <w:pPr>
+        <w:pStyle w:val="Normal"/>
+        <w:pBdr>
+          <w:top w:val="single" w:sz="2" w:space="0" w:color="CCCCCC"/>
+          <w:bottom w:val="single" w:sz="2" w:space="0" w:color="CCCCCC"/>
+        </w:pBdr>
+        <w:spacing w:before="200" w:after="100"/>
+        <w:jc w:val="center"/>
+        <w:rPr>
+          <w:i/>
+          <w:i/>
+          <w:iCs/>
+          <w:color w:val="555555"/>
+          <w:sz w:val="22"/>
+          <w:szCs w:val="22"/>
+        </w:rPr>
+      </w:pPr>
+      <w:r>
+        <w:rPr>
+          <w:i/>
+          <w:iCs/>
+          <w:color w:val="555555"/>
+          <w:sz w:val="22"/>
+          <w:szCs w:val="22"/>
+        </w:rPr>
         <w:drawing>
-          <wp:anchor behindDoc="0" distT="0" distB="0" distL="0" distR="0" simplePos="0" locked="0" layoutInCell="0" allowOverlap="1" relativeHeight="15">
+          <wp:anchor behindDoc="0" distT="0" distB="0" distL="0" distR="0" simplePos="0" locked="0" layoutInCell="0" allowOverlap="1" relativeHeight="25">
             <wp:simplePos x="0" y="0"/>
             <wp:positionH relativeFrom="column">
-              <wp:align>center</wp:align>
+              <wp:posOffset>-385445</wp:posOffset>
             </wp:positionH>
             <wp:positionV relativeFrom="paragraph">
-              <wp:posOffset>635</wp:posOffset>
+              <wp:posOffset>-12065</wp:posOffset>
             </wp:positionV>
-            <wp:extent cx="6242050" cy="2575560"/>
+            <wp:extent cx="6090285" cy="2526030"/>
             <wp:effectExtent l="0" t="0" r="0" b="0"/>
             <wp:wrapSquare wrapText="largest"/>
-            <wp:docPr id="20" name="Image14" descr=""/>
+            <wp:docPr id="20" name="Image26" descr=""/>
             <wp:cNvGraphicFramePr>
               <a:graphicFrameLocks xmlns:a="http://schemas.openxmlformats.org/drawingml/2006/main" noChangeAspect="1"/>
             </wp:cNvGraphicFramePr>
@@ -15409,7 +15451,7 @@
               <a:graphicData uri="http://schemas.openxmlformats.org/drawingml/2006/picture">
                 <pic:pic xmlns:pic="http://schemas.openxmlformats.org/drawingml/2006/picture">
                   <pic:nvPicPr>
-                    <pic:cNvPr id="20" name="Image14" descr=""/>
+                    <pic:cNvPr id="20" name="Image26" descr=""/>
                     <pic:cNvPicPr>
                       <a:picLocks noChangeAspect="1" noChangeArrowheads="1"/>
                     </pic:cNvPicPr>
@@ -15423,7 +15465,7 @@
                   <pic:spPr bwMode="auto">
                     <a:xfrm>
                       <a:off x="0" y="0"/>
-                      <a:ext cx="6242050" cy="2575560"/>
+                      <a:ext cx="6090285" cy="2526030"/>
                     </a:xfrm>
                     <a:prstGeom prst="rect">
                       <a:avLst/>
@@ -15445,17 +15487,23 @@
         </w:pBdr>
         <w:spacing w:before="200" w:after="100"/>
         <w:jc w:val="center"/>
-        <w:rPr/>
-      </w:pPr>
-      <w:r>
-        <w:rPr>
+        <w:rPr>
+          <w:i/>
           <w:i/>
           <w:iCs/>
           <w:color w:val="555555"/>
           <w:sz w:val="22"/>
           <w:szCs w:val="22"/>
         </w:rPr>
-        <w:t>[Figure 5.8: Email Integration]</w:t>
+      </w:pPr>
+      <w:r>
+        <w:rPr>
+          <w:i/>
+          <w:iCs/>
+          <w:color w:val="555555"/>
+          <w:sz w:val="22"/>
+          <w:szCs w:val="22"/>
+        </w:rPr>
       </w:r>
     </w:p>
     <w:p>
@@ -15484,6 +15532,7 @@
           <w:sz w:val="22"/>
           <w:szCs w:val="22"/>
         </w:rPr>
+        <w:t>[Figure 5.8: Content Topics]</w:t>
       </w:r>
     </w:p>
     <w:p>
@@ -15568,19 +15617,47 @@
           <w:sz w:val="22"/>
           <w:szCs w:val="22"/>
         </w:rPr>
+      </w:r>
+    </w:p>
+    <w:p>
+      <w:pPr>
+        <w:pStyle w:val="Normal"/>
+        <w:pBdr>
+          <w:top w:val="single" w:sz="2" w:space="0" w:color="CCCCCC"/>
+          <w:bottom w:val="single" w:sz="2" w:space="0" w:color="CCCCCC"/>
+        </w:pBdr>
+        <w:spacing w:before="200" w:after="100"/>
+        <w:jc w:val="center"/>
+        <w:rPr>
+          <w:i/>
+          <w:i/>
+          <w:iCs/>
+          <w:color w:val="555555"/>
+          <w:sz w:val="22"/>
+          <w:szCs w:val="22"/>
+        </w:rPr>
+      </w:pPr>
+      <w:r>
+        <w:rPr>
+          <w:i/>
+          <w:iCs/>
+          <w:color w:val="555555"/>
+          <w:sz w:val="22"/>
+          <w:szCs w:val="22"/>
+        </w:rPr>
         <w:drawing>
-          <wp:anchor behindDoc="0" distT="0" distB="0" distL="0" distR="0" simplePos="0" locked="0" layoutInCell="0" allowOverlap="1" relativeHeight="16">
+          <wp:anchor behindDoc="0" distT="0" distB="0" distL="0" distR="0" simplePos="0" locked="0" layoutInCell="0" allowOverlap="1" relativeHeight="31">
             <wp:simplePos x="0" y="0"/>
             <wp:positionH relativeFrom="column">
-              <wp:align>center</wp:align>
+              <wp:posOffset>-417830</wp:posOffset>
             </wp:positionH>
             <wp:positionV relativeFrom="paragraph">
-              <wp:posOffset>635</wp:posOffset>
+              <wp:posOffset>8255</wp:posOffset>
             </wp:positionV>
-            <wp:extent cx="6146165" cy="2536190"/>
+            <wp:extent cx="6214745" cy="2578100"/>
             <wp:effectExtent l="0" t="0" r="0" b="0"/>
             <wp:wrapSquare wrapText="largest"/>
-            <wp:docPr id="21" name="Image15" descr=""/>
+            <wp:docPr id="21" name="Image28" descr=""/>
             <wp:cNvGraphicFramePr>
               <a:graphicFrameLocks xmlns:a="http://schemas.openxmlformats.org/drawingml/2006/main" noChangeAspect="1"/>
             </wp:cNvGraphicFramePr>
@@ -15588,7 +15665,7 @@
               <a:graphicData uri="http://schemas.openxmlformats.org/drawingml/2006/picture">
                 <pic:pic xmlns:pic="http://schemas.openxmlformats.org/drawingml/2006/picture">
                   <pic:nvPicPr>
-                    <pic:cNvPr id="21" name="Image15" descr=""/>
+                    <pic:cNvPr id="21" name="Image28" descr=""/>
                     <pic:cNvPicPr>
                       <a:picLocks noChangeAspect="1" noChangeArrowheads="1"/>
                     </pic:cNvPicPr>
@@ -15602,7 +15679,7 @@
                   <pic:spPr bwMode="auto">
                     <a:xfrm>
                       <a:off x="0" y="0"/>
-                      <a:ext cx="6146165" cy="2536190"/>
+                      <a:ext cx="6214745" cy="2578100"/>
                     </a:xfrm>
                     <a:prstGeom prst="rect">
                       <a:avLst/>
@@ -15624,17 +15701,23 @@
         </w:pBdr>
         <w:spacing w:before="200" w:after="100"/>
         <w:jc w:val="center"/>
-        <w:rPr/>
-      </w:pPr>
-      <w:r>
-        <w:rPr>
+        <w:rPr>
+          <w:i/>
           <w:i/>
           <w:iCs/>
           <w:color w:val="555555"/>
           <w:sz w:val="22"/>
           <w:szCs w:val="22"/>
         </w:rPr>
-        <w:t>[Figure 5.9: Content Review Center]</w:t>
+      </w:pPr>
+      <w:r>
+        <w:rPr>
+          <w:i/>
+          <w:iCs/>
+          <w:color w:val="555555"/>
+          <w:sz w:val="22"/>
+          <w:szCs w:val="22"/>
+        </w:rPr>
       </w:r>
     </w:p>
     <w:p>
@@ -15663,6 +15746,7 @@
           <w:sz w:val="22"/>
           <w:szCs w:val="22"/>
         </w:rPr>
+        <w:t>[Figure 5.9: Generated Post]</w:t>
       </w:r>
     </w:p>
     <w:p>
@@ -15804,7 +15888,477 @@
           <w:szCs w:val="22"/>
         </w:rPr>
         <w:drawing>
-          <wp:anchor behindDoc="0" distT="0" distB="0" distL="0" distR="0" simplePos="0" locked="0" layoutInCell="0" allowOverlap="1" relativeHeight="17">
+          <wp:anchor behindDoc="0" distT="0" distB="0" distL="0" distR="0" simplePos="0" locked="0" layoutInCell="0" allowOverlap="1" relativeHeight="26">
+            <wp:simplePos x="0" y="0"/>
+            <wp:positionH relativeFrom="column">
+              <wp:posOffset>-509905</wp:posOffset>
+            </wp:positionH>
+            <wp:positionV relativeFrom="paragraph">
+              <wp:posOffset>-5080</wp:posOffset>
+            </wp:positionV>
+            <wp:extent cx="6335395" cy="2627630"/>
+            <wp:effectExtent l="0" t="0" r="0" b="0"/>
+            <wp:wrapSquare wrapText="largest"/>
+            <wp:docPr id="22" name="Image14" descr=""/>
+            <wp:cNvGraphicFramePr>
+              <a:graphicFrameLocks xmlns:a="http://schemas.openxmlformats.org/drawingml/2006/main" noChangeAspect="1"/>
+            </wp:cNvGraphicFramePr>
+            <a:graphic xmlns:a="http://schemas.openxmlformats.org/drawingml/2006/main">
+              <a:graphicData uri="http://schemas.openxmlformats.org/drawingml/2006/picture">
+                <pic:pic xmlns:pic="http://schemas.openxmlformats.org/drawingml/2006/picture">
+                  <pic:nvPicPr>
+                    <pic:cNvPr id="22" name="Image14" descr=""/>
+                    <pic:cNvPicPr>
+                      <a:picLocks noChangeAspect="1" noChangeArrowheads="1"/>
+                    </pic:cNvPicPr>
+                  </pic:nvPicPr>
+                  <pic:blipFill>
+                    <a:blip r:embed="rId23"/>
+                    <a:stretch>
+                      <a:fillRect/>
+                    </a:stretch>
+                  </pic:blipFill>
+                  <pic:spPr bwMode="auto">
+                    <a:xfrm>
+                      <a:off x="0" y="0"/>
+                      <a:ext cx="6335395" cy="2627630"/>
+                    </a:xfrm>
+                    <a:prstGeom prst="rect">
+                      <a:avLst/>
+                    </a:prstGeom>
+                  </pic:spPr>
+                </pic:pic>
+              </a:graphicData>
+            </a:graphic>
+          </wp:anchor>
+        </w:drawing>
+      </w:r>
+    </w:p>
+    <w:p>
+      <w:pPr>
+        <w:pStyle w:val="Normal"/>
+        <w:pBdr>
+          <w:top w:val="single" w:sz="2" w:space="0" w:color="CCCCCC"/>
+          <w:bottom w:val="single" w:sz="2" w:space="0" w:color="CCCCCC"/>
+        </w:pBdr>
+        <w:spacing w:before="200" w:after="100"/>
+        <w:jc w:val="center"/>
+        <w:rPr>
+          <w:i/>
+          <w:i/>
+          <w:iCs/>
+          <w:color w:val="555555"/>
+          <w:sz w:val="22"/>
+          <w:szCs w:val="22"/>
+        </w:rPr>
+      </w:pPr>
+      <w:r>
+        <w:rPr>
+          <w:i/>
+          <w:iCs/>
+          <w:color w:val="555555"/>
+          <w:sz w:val="22"/>
+          <w:szCs w:val="22"/>
+        </w:rPr>
+      </w:r>
+    </w:p>
+    <w:p>
+      <w:pPr>
+        <w:pStyle w:val="Normal"/>
+        <w:pBdr>
+          <w:top w:val="single" w:sz="2" w:space="0" w:color="CCCCCC"/>
+          <w:bottom w:val="single" w:sz="2" w:space="0" w:color="CCCCCC"/>
+        </w:pBdr>
+        <w:spacing w:before="200" w:after="100"/>
+        <w:jc w:val="center"/>
+        <w:rPr>
+          <w:i/>
+          <w:i/>
+          <w:iCs/>
+          <w:color w:val="555555"/>
+          <w:sz w:val="22"/>
+          <w:szCs w:val="22"/>
+        </w:rPr>
+      </w:pPr>
+      <w:r>
+        <w:rPr>
+          <w:i/>
+          <w:iCs/>
+          <w:color w:val="555555"/>
+          <w:sz w:val="22"/>
+          <w:szCs w:val="22"/>
+        </w:rPr>
+      </w:r>
+    </w:p>
+    <w:p>
+      <w:pPr>
+        <w:pStyle w:val="Normal"/>
+        <w:pBdr>
+          <w:top w:val="single" w:sz="2" w:space="0" w:color="CCCCCC"/>
+          <w:bottom w:val="single" w:sz="2" w:space="0" w:color="CCCCCC"/>
+        </w:pBdr>
+        <w:spacing w:before="200" w:after="100"/>
+        <w:jc w:val="center"/>
+        <w:rPr/>
+      </w:pPr>
+      <w:r>
+        <w:rPr>
+          <w:i/>
+          <w:iCs/>
+          <w:color w:val="555555"/>
+          <w:sz w:val="22"/>
+          <w:szCs w:val="22"/>
+        </w:rPr>
+        <w:t>[Figure 5.10: Email Integration]</w:t>
+      </w:r>
+    </w:p>
+    <w:p>
+      <w:pPr>
+        <w:pStyle w:val="Normal"/>
+        <w:pBdr>
+          <w:top w:val="single" w:sz="2" w:space="0" w:color="CCCCCC"/>
+          <w:bottom w:val="single" w:sz="2" w:space="0" w:color="CCCCCC"/>
+        </w:pBdr>
+        <w:spacing w:before="200" w:after="100"/>
+        <w:jc w:val="center"/>
+        <w:rPr>
+          <w:i/>
+          <w:i/>
+          <w:iCs/>
+          <w:color w:val="555555"/>
+          <w:sz w:val="22"/>
+          <w:szCs w:val="22"/>
+        </w:rPr>
+      </w:pPr>
+      <w:r>
+        <w:rPr>
+          <w:i/>
+          <w:iCs/>
+          <w:color w:val="555555"/>
+          <w:sz w:val="22"/>
+          <w:szCs w:val="22"/>
+        </w:rPr>
+      </w:r>
+    </w:p>
+    <w:p>
+      <w:pPr>
+        <w:pStyle w:val="Normal"/>
+        <w:pBdr>
+          <w:top w:val="single" w:sz="2" w:space="0" w:color="CCCCCC"/>
+          <w:bottom w:val="single" w:sz="2" w:space="0" w:color="CCCCCC"/>
+        </w:pBdr>
+        <w:spacing w:before="200" w:after="100"/>
+        <w:jc w:val="center"/>
+        <w:rPr>
+          <w:i/>
+          <w:i/>
+          <w:iCs/>
+          <w:color w:val="555555"/>
+          <w:sz w:val="22"/>
+          <w:szCs w:val="22"/>
+        </w:rPr>
+      </w:pPr>
+      <w:r>
+        <w:rPr>
+          <w:i/>
+          <w:iCs/>
+          <w:color w:val="555555"/>
+          <w:sz w:val="22"/>
+          <w:szCs w:val="22"/>
+        </w:rPr>
+      </w:r>
+    </w:p>
+    <w:p>
+      <w:pPr>
+        <w:pStyle w:val="Normal"/>
+        <w:pBdr>
+          <w:top w:val="single" w:sz="2" w:space="0" w:color="CCCCCC"/>
+          <w:bottom w:val="single" w:sz="2" w:space="0" w:color="CCCCCC"/>
+        </w:pBdr>
+        <w:spacing w:before="200" w:after="100"/>
+        <w:jc w:val="center"/>
+        <w:rPr>
+          <w:i/>
+          <w:i/>
+          <w:iCs/>
+          <w:color w:val="555555"/>
+          <w:sz w:val="22"/>
+          <w:szCs w:val="22"/>
+        </w:rPr>
+      </w:pPr>
+      <w:r>
+        <w:rPr>
+          <w:i/>
+          <w:iCs/>
+          <w:color w:val="555555"/>
+          <w:sz w:val="22"/>
+          <w:szCs w:val="22"/>
+        </w:rPr>
+        <w:drawing>
+          <wp:anchor behindDoc="0" distT="0" distB="0" distL="0" distR="0" simplePos="0" locked="0" layoutInCell="0" allowOverlap="1" relativeHeight="27">
+            <wp:simplePos x="0" y="0"/>
+            <wp:positionH relativeFrom="column">
+              <wp:posOffset>-473710</wp:posOffset>
+            </wp:positionH>
+            <wp:positionV relativeFrom="paragraph">
+              <wp:posOffset>635</wp:posOffset>
+            </wp:positionV>
+            <wp:extent cx="6252210" cy="2593340"/>
+            <wp:effectExtent l="0" t="0" r="0" b="0"/>
+            <wp:wrapSquare wrapText="largest"/>
+            <wp:docPr id="23" name="Image15" descr=""/>
+            <wp:cNvGraphicFramePr>
+              <a:graphicFrameLocks xmlns:a="http://schemas.openxmlformats.org/drawingml/2006/main" noChangeAspect="1"/>
+            </wp:cNvGraphicFramePr>
+            <a:graphic xmlns:a="http://schemas.openxmlformats.org/drawingml/2006/main">
+              <a:graphicData uri="http://schemas.openxmlformats.org/drawingml/2006/picture">
+                <pic:pic xmlns:pic="http://schemas.openxmlformats.org/drawingml/2006/picture">
+                  <pic:nvPicPr>
+                    <pic:cNvPr id="23" name="Image15" descr=""/>
+                    <pic:cNvPicPr>
+                      <a:picLocks noChangeAspect="1" noChangeArrowheads="1"/>
+                    </pic:cNvPicPr>
+                  </pic:nvPicPr>
+                  <pic:blipFill>
+                    <a:blip r:embed="rId24"/>
+                    <a:stretch>
+                      <a:fillRect/>
+                    </a:stretch>
+                  </pic:blipFill>
+                  <pic:spPr bwMode="auto">
+                    <a:xfrm>
+                      <a:off x="0" y="0"/>
+                      <a:ext cx="6252210" cy="2593340"/>
+                    </a:xfrm>
+                    <a:prstGeom prst="rect">
+                      <a:avLst/>
+                    </a:prstGeom>
+                  </pic:spPr>
+                </pic:pic>
+              </a:graphicData>
+            </a:graphic>
+          </wp:anchor>
+        </w:drawing>
+      </w:r>
+    </w:p>
+    <w:p>
+      <w:pPr>
+        <w:pStyle w:val="Normal"/>
+        <w:pBdr>
+          <w:top w:val="single" w:sz="2" w:space="0" w:color="CCCCCC"/>
+          <w:bottom w:val="single" w:sz="2" w:space="0" w:color="CCCCCC"/>
+        </w:pBdr>
+        <w:spacing w:before="200" w:after="100"/>
+        <w:jc w:val="center"/>
+        <w:rPr>
+          <w:i/>
+          <w:i/>
+          <w:iCs/>
+          <w:color w:val="555555"/>
+          <w:sz w:val="22"/>
+          <w:szCs w:val="22"/>
+        </w:rPr>
+      </w:pPr>
+      <w:r>
+        <w:rPr>
+          <w:i/>
+          <w:iCs/>
+          <w:color w:val="555555"/>
+          <w:sz w:val="22"/>
+          <w:szCs w:val="22"/>
+        </w:rPr>
+      </w:r>
+    </w:p>
+    <w:p>
+      <w:pPr>
+        <w:pStyle w:val="Normal"/>
+        <w:pBdr>
+          <w:top w:val="single" w:sz="2" w:space="0" w:color="CCCCCC"/>
+          <w:bottom w:val="single" w:sz="2" w:space="0" w:color="CCCCCC"/>
+        </w:pBdr>
+        <w:spacing w:before="200" w:after="100"/>
+        <w:jc w:val="center"/>
+        <w:rPr/>
+      </w:pPr>
+      <w:r>
+        <w:rPr>
+          <w:i/>
+          <w:iCs/>
+          <w:color w:val="555555"/>
+          <w:sz w:val="22"/>
+          <w:szCs w:val="22"/>
+        </w:rPr>
+        <w:t>[Figure 5.11: Content Review Center]</w:t>
+      </w:r>
+    </w:p>
+    <w:p>
+      <w:pPr>
+        <w:pStyle w:val="Normal"/>
+        <w:pBdr>
+          <w:top w:val="single" w:sz="2" w:space="0" w:color="CCCCCC"/>
+          <w:bottom w:val="single" w:sz="2" w:space="0" w:color="CCCCCC"/>
+        </w:pBdr>
+        <w:spacing w:before="200" w:after="100"/>
+        <w:jc w:val="center"/>
+        <w:rPr>
+          <w:i/>
+          <w:i/>
+          <w:iCs/>
+          <w:color w:val="555555"/>
+          <w:sz w:val="22"/>
+          <w:szCs w:val="22"/>
+        </w:rPr>
+      </w:pPr>
+      <w:r>
+        <w:rPr>
+          <w:i/>
+          <w:iCs/>
+          <w:color w:val="555555"/>
+          <w:sz w:val="22"/>
+          <w:szCs w:val="22"/>
+        </w:rPr>
+      </w:r>
+    </w:p>
+    <w:p>
+      <w:pPr>
+        <w:pStyle w:val="Normal"/>
+        <w:pBdr>
+          <w:top w:val="single" w:sz="2" w:space="0" w:color="CCCCCC"/>
+          <w:bottom w:val="single" w:sz="2" w:space="0" w:color="CCCCCC"/>
+        </w:pBdr>
+        <w:spacing w:before="200" w:after="100"/>
+        <w:jc w:val="center"/>
+        <w:rPr>
+          <w:i/>
+          <w:i/>
+          <w:iCs/>
+          <w:color w:val="555555"/>
+          <w:sz w:val="22"/>
+          <w:szCs w:val="22"/>
+        </w:rPr>
+      </w:pPr>
+      <w:r>
+        <w:rPr>
+          <w:i/>
+          <w:iCs/>
+          <w:color w:val="555555"/>
+          <w:sz w:val="22"/>
+          <w:szCs w:val="22"/>
+        </w:rPr>
+      </w:r>
+    </w:p>
+    <w:p>
+      <w:pPr>
+        <w:pStyle w:val="Normal"/>
+        <w:pBdr>
+          <w:top w:val="single" w:sz="2" w:space="0" w:color="CCCCCC"/>
+          <w:bottom w:val="single" w:sz="2" w:space="0" w:color="CCCCCC"/>
+        </w:pBdr>
+        <w:spacing w:before="200" w:after="100"/>
+        <w:jc w:val="center"/>
+        <w:rPr>
+          <w:i/>
+          <w:i/>
+          <w:iCs/>
+          <w:color w:val="555555"/>
+          <w:sz w:val="22"/>
+          <w:szCs w:val="22"/>
+        </w:rPr>
+      </w:pPr>
+      <w:r>
+        <w:rPr>
+          <w:i/>
+          <w:iCs/>
+          <w:color w:val="555555"/>
+          <w:sz w:val="22"/>
+          <w:szCs w:val="22"/>
+        </w:rPr>
+      </w:r>
+    </w:p>
+    <w:p>
+      <w:pPr>
+        <w:pStyle w:val="Normal"/>
+        <w:pBdr>
+          <w:top w:val="single" w:sz="2" w:space="0" w:color="CCCCCC"/>
+          <w:bottom w:val="single" w:sz="2" w:space="0" w:color="CCCCCC"/>
+        </w:pBdr>
+        <w:spacing w:before="200" w:after="100"/>
+        <w:jc w:val="center"/>
+        <w:rPr>
+          <w:i/>
+          <w:i/>
+          <w:iCs/>
+          <w:color w:val="555555"/>
+          <w:sz w:val="22"/>
+          <w:szCs w:val="22"/>
+        </w:rPr>
+      </w:pPr>
+      <w:r>
+        <w:rPr>
+          <w:i/>
+          <w:iCs/>
+          <w:color w:val="555555"/>
+          <w:sz w:val="22"/>
+          <w:szCs w:val="22"/>
+        </w:rPr>
+      </w:r>
+    </w:p>
+    <w:p>
+      <w:pPr>
+        <w:pStyle w:val="Normal"/>
+        <w:pBdr>
+          <w:top w:val="single" w:sz="2" w:space="0" w:color="CCCCCC"/>
+          <w:bottom w:val="single" w:sz="2" w:space="0" w:color="CCCCCC"/>
+        </w:pBdr>
+        <w:spacing w:before="200" w:after="100"/>
+        <w:jc w:val="center"/>
+        <w:rPr>
+          <w:i/>
+          <w:i/>
+          <w:iCs/>
+          <w:color w:val="555555"/>
+          <w:sz w:val="22"/>
+          <w:szCs w:val="22"/>
+        </w:rPr>
+      </w:pPr>
+      <w:r>
+        <w:rPr>
+          <w:i/>
+          <w:iCs/>
+          <w:color w:val="555555"/>
+          <w:sz w:val="22"/>
+          <w:szCs w:val="22"/>
+        </w:rPr>
+      </w:r>
+    </w:p>
+    <w:p>
+      <w:pPr>
+        <w:pStyle w:val="Normal"/>
+        <w:pBdr>
+          <w:top w:val="single" w:sz="2" w:space="0" w:color="CCCCCC"/>
+          <w:bottom w:val="single" w:sz="2" w:space="0" w:color="CCCCCC"/>
+        </w:pBdr>
+        <w:spacing w:before="200" w:after="100"/>
+        <w:jc w:val="center"/>
+        <w:rPr>
+          <w:i/>
+          <w:i/>
+          <w:iCs/>
+          <w:color w:val="555555"/>
+          <w:sz w:val="22"/>
+          <w:szCs w:val="22"/>
+        </w:rPr>
+      </w:pPr>
+      <w:r>
+        <w:rPr>
+          <w:i/>
+          <w:iCs/>
+          <w:color w:val="555555"/>
+          <w:sz w:val="22"/>
+          <w:szCs w:val="22"/>
+        </w:rPr>
+        <w:drawing>
+          <wp:anchor behindDoc="0" distT="0" distB="0" distL="0" distR="0" simplePos="0" locked="0" layoutInCell="0" allowOverlap="1" relativeHeight="12">
             <wp:simplePos x="0" y="0"/>
             <wp:positionH relativeFrom="column">
               <wp:align>center</wp:align>
@@ -15815,7 +16369,7 @@
             <wp:extent cx="6380480" cy="2632710"/>
             <wp:effectExtent l="0" t="0" r="0" b="0"/>
             <wp:wrapSquare wrapText="largest"/>
-            <wp:docPr id="22" name="Image16" descr=""/>
+            <wp:docPr id="24" name="Image16" descr=""/>
             <wp:cNvGraphicFramePr>
               <a:graphicFrameLocks xmlns:a="http://schemas.openxmlformats.org/drawingml/2006/main" noChangeAspect="1"/>
             </wp:cNvGraphicFramePr>
@@ -15823,13 +16377,13 @@
               <a:graphicData uri="http://schemas.openxmlformats.org/drawingml/2006/picture">
                 <pic:pic xmlns:pic="http://schemas.openxmlformats.org/drawingml/2006/picture">
                   <pic:nvPicPr>
-                    <pic:cNvPr id="22" name="Image16" descr=""/>
+                    <pic:cNvPr id="24" name="Image16" descr=""/>
                     <pic:cNvPicPr>
                       <a:picLocks noChangeAspect="1" noChangeArrowheads="1"/>
                     </pic:cNvPicPr>
                   </pic:nvPicPr>
                   <pic:blipFill>
-                    <a:blip r:embed="rId23"/>
+                    <a:blip r:embed="rId25"/>
                     <a:stretch>
                       <a:fillRect/>
                     </a:stretch>
@@ -15869,7 +16423,7 @@
           <w:sz w:val="22"/>
           <w:szCs w:val="22"/>
         </w:rPr>
-        <w:t>[Figure 5.10: Published History]</w:t>
+        <w:t>[Figure 5.12: Published History]</w:t>
       </w:r>
     </w:p>
     <w:p>
@@ -15955,18 +16509,18 @@
           <w:szCs w:val="22"/>
         </w:rPr>
         <w:drawing>
-          <wp:anchor behindDoc="0" distT="0" distB="0" distL="0" distR="0" simplePos="0" locked="0" layoutInCell="0" allowOverlap="1" relativeHeight="18">
+          <wp:anchor behindDoc="0" distT="0" distB="0" distL="0" distR="0" simplePos="0" locked="0" layoutInCell="0" allowOverlap="1" relativeHeight="28">
             <wp:simplePos x="0" y="0"/>
             <wp:positionH relativeFrom="column">
-              <wp:align>center</wp:align>
+              <wp:posOffset>-397510</wp:posOffset>
             </wp:positionH>
             <wp:positionV relativeFrom="paragraph">
-              <wp:posOffset>635</wp:posOffset>
+              <wp:posOffset>114300</wp:posOffset>
             </wp:positionV>
-            <wp:extent cx="6139815" cy="2533650"/>
+            <wp:extent cx="6137910" cy="2864485"/>
             <wp:effectExtent l="0" t="0" r="0" b="0"/>
             <wp:wrapSquare wrapText="largest"/>
-            <wp:docPr id="23" name="Image17" descr=""/>
+            <wp:docPr id="25" name="Image17" descr=""/>
             <wp:cNvGraphicFramePr>
               <a:graphicFrameLocks xmlns:a="http://schemas.openxmlformats.org/drawingml/2006/main" noChangeAspect="1"/>
             </wp:cNvGraphicFramePr>
@@ -15974,393 +16528,7 @@
               <a:graphicData uri="http://schemas.openxmlformats.org/drawingml/2006/picture">
                 <pic:pic xmlns:pic="http://schemas.openxmlformats.org/drawingml/2006/picture">
                   <pic:nvPicPr>
-                    <pic:cNvPr id="23" name="Image17" descr=""/>
-                    <pic:cNvPicPr>
-                      <a:picLocks noChangeAspect="1" noChangeArrowheads="1"/>
-                    </pic:cNvPicPr>
-                  </pic:nvPicPr>
-                  <pic:blipFill>
-                    <a:blip r:embed="rId24"/>
-                    <a:stretch>
-                      <a:fillRect/>
-                    </a:stretch>
-                  </pic:blipFill>
-                  <pic:spPr bwMode="auto">
-                    <a:xfrm>
-                      <a:off x="0" y="0"/>
-                      <a:ext cx="6139815" cy="2533650"/>
-                    </a:xfrm>
-                    <a:prstGeom prst="rect">
-                      <a:avLst/>
-                    </a:prstGeom>
-                  </pic:spPr>
-                </pic:pic>
-              </a:graphicData>
-            </a:graphic>
-          </wp:anchor>
-        </w:drawing>
-      </w:r>
-    </w:p>
-    <w:p>
-      <w:pPr>
-        <w:pStyle w:val="Normal"/>
-        <w:pBdr>
-          <w:top w:val="single" w:sz="2" w:space="0" w:color="CCCCCC"/>
-          <w:bottom w:val="single" w:sz="2" w:space="0" w:color="CCCCCC"/>
-        </w:pBdr>
-        <w:spacing w:before="200" w:after="100"/>
-        <w:jc w:val="center"/>
-        <w:rPr/>
-      </w:pPr>
-      <w:r>
-        <w:rPr>
-          <w:i/>
-          <w:iCs/>
-          <w:color w:val="555555"/>
-          <w:sz w:val="22"/>
-          <w:szCs w:val="22"/>
-        </w:rPr>
-        <w:t>[Figure 5.11: Custom Topic]</w:t>
-      </w:r>
-    </w:p>
-    <w:p>
-      <w:pPr>
-        <w:pStyle w:val="Normal"/>
-        <w:pBdr>
-          <w:top w:val="single" w:sz="2" w:space="0" w:color="CCCCCC"/>
-          <w:bottom w:val="single" w:sz="2" w:space="0" w:color="CCCCCC"/>
-        </w:pBdr>
-        <w:spacing w:before="200" w:after="100"/>
-        <w:jc w:val="center"/>
-        <w:rPr>
-          <w:i/>
-          <w:i/>
-          <w:iCs/>
-          <w:color w:val="555555"/>
-          <w:sz w:val="22"/>
-          <w:szCs w:val="22"/>
-        </w:rPr>
-      </w:pPr>
-      <w:r>
-        <w:rPr>
-          <w:i/>
-          <w:iCs/>
-          <w:color w:val="555555"/>
-          <w:sz w:val="22"/>
-          <w:szCs w:val="22"/>
-        </w:rPr>
-      </w:r>
-    </w:p>
-    <w:p>
-      <w:pPr>
-        <w:pStyle w:val="Normal"/>
-        <w:pBdr>
-          <w:top w:val="single" w:sz="2" w:space="0" w:color="CCCCCC"/>
-          <w:bottom w:val="single" w:sz="2" w:space="0" w:color="CCCCCC"/>
-        </w:pBdr>
-        <w:spacing w:before="200" w:after="100"/>
-        <w:jc w:val="center"/>
-        <w:rPr>
-          <w:i/>
-          <w:i/>
-          <w:iCs/>
-          <w:color w:val="555555"/>
-          <w:sz w:val="22"/>
-          <w:szCs w:val="22"/>
-        </w:rPr>
-      </w:pPr>
-      <w:r>
-        <w:rPr>
-          <w:i/>
-          <w:iCs/>
-          <w:color w:val="555555"/>
-          <w:sz w:val="22"/>
-          <w:szCs w:val="22"/>
-        </w:rPr>
-      </w:r>
-    </w:p>
-    <w:p>
-      <w:pPr>
-        <w:pStyle w:val="Normal"/>
-        <w:pBdr>
-          <w:top w:val="single" w:sz="2" w:space="0" w:color="CCCCCC"/>
-          <w:bottom w:val="single" w:sz="2" w:space="0" w:color="CCCCCC"/>
-        </w:pBdr>
-        <w:spacing w:before="200" w:after="100"/>
-        <w:jc w:val="center"/>
-        <w:rPr>
-          <w:i/>
-          <w:i/>
-          <w:iCs/>
-          <w:color w:val="555555"/>
-          <w:sz w:val="22"/>
-          <w:szCs w:val="22"/>
-        </w:rPr>
-      </w:pPr>
-      <w:r>
-        <w:rPr>
-          <w:i/>
-          <w:iCs/>
-          <w:color w:val="555555"/>
-          <w:sz w:val="22"/>
-          <w:szCs w:val="22"/>
-        </w:rPr>
-      </w:r>
-    </w:p>
-    <w:p>
-      <w:pPr>
-        <w:pStyle w:val="Normal"/>
-        <w:pBdr>
-          <w:top w:val="single" w:sz="2" w:space="0" w:color="CCCCCC"/>
-          <w:bottom w:val="single" w:sz="2" w:space="0" w:color="CCCCCC"/>
-        </w:pBdr>
-        <w:spacing w:before="200" w:after="100"/>
-        <w:jc w:val="center"/>
-        <w:rPr>
-          <w:i/>
-          <w:i/>
-          <w:iCs/>
-          <w:color w:val="555555"/>
-          <w:sz w:val="22"/>
-          <w:szCs w:val="22"/>
-        </w:rPr>
-      </w:pPr>
-      <w:r>
-        <w:rPr>
-          <w:i/>
-          <w:iCs/>
-          <w:color w:val="555555"/>
-          <w:sz w:val="22"/>
-          <w:szCs w:val="22"/>
-        </w:rPr>
-      </w:r>
-    </w:p>
-    <w:p>
-      <w:pPr>
-        <w:pStyle w:val="Normal"/>
-        <w:pBdr>
-          <w:top w:val="single" w:sz="2" w:space="0" w:color="CCCCCC"/>
-          <w:bottom w:val="single" w:sz="2" w:space="0" w:color="CCCCCC"/>
-        </w:pBdr>
-        <w:spacing w:before="200" w:after="100"/>
-        <w:jc w:val="center"/>
-        <w:rPr>
-          <w:i/>
-          <w:i/>
-          <w:iCs/>
-          <w:color w:val="555555"/>
-          <w:sz w:val="22"/>
-          <w:szCs w:val="22"/>
-        </w:rPr>
-      </w:pPr>
-      <w:r>
-        <w:rPr>
-          <w:i/>
-          <w:iCs/>
-          <w:color w:val="555555"/>
-          <w:sz w:val="22"/>
-          <w:szCs w:val="22"/>
-        </w:rPr>
-      </w:r>
-    </w:p>
-    <w:p>
-      <w:pPr>
-        <w:pStyle w:val="Normal"/>
-        <w:pBdr>
-          <w:top w:val="single" w:sz="2" w:space="0" w:color="CCCCCC"/>
-          <w:bottom w:val="single" w:sz="2" w:space="0" w:color="CCCCCC"/>
-        </w:pBdr>
-        <w:spacing w:before="200" w:after="100"/>
-        <w:jc w:val="center"/>
-        <w:rPr>
-          <w:i/>
-          <w:i/>
-          <w:iCs/>
-          <w:color w:val="555555"/>
-          <w:sz w:val="22"/>
-          <w:szCs w:val="22"/>
-        </w:rPr>
-      </w:pPr>
-      <w:r>
-        <w:rPr>
-          <w:i/>
-          <w:iCs/>
-          <w:color w:val="555555"/>
-          <w:sz w:val="22"/>
-          <w:szCs w:val="22"/>
-        </w:rPr>
-        <w:drawing>
-          <wp:anchor behindDoc="0" distT="0" distB="0" distL="0" distR="0" simplePos="0" locked="0" layoutInCell="0" allowOverlap="1" relativeHeight="19">
-            <wp:simplePos x="0" y="0"/>
-            <wp:positionH relativeFrom="column">
-              <wp:align>center</wp:align>
-            </wp:positionH>
-            <wp:positionV relativeFrom="paragraph">
-              <wp:posOffset>635</wp:posOffset>
-            </wp:positionV>
-            <wp:extent cx="6179820" cy="2550160"/>
-            <wp:effectExtent l="0" t="0" r="0" b="0"/>
-            <wp:wrapSquare wrapText="largest"/>
-            <wp:docPr id="24" name="Image18" descr=""/>
-            <wp:cNvGraphicFramePr>
-              <a:graphicFrameLocks xmlns:a="http://schemas.openxmlformats.org/drawingml/2006/main" noChangeAspect="1"/>
-            </wp:cNvGraphicFramePr>
-            <a:graphic xmlns:a="http://schemas.openxmlformats.org/drawingml/2006/main">
-              <a:graphicData uri="http://schemas.openxmlformats.org/drawingml/2006/picture">
-                <pic:pic xmlns:pic="http://schemas.openxmlformats.org/drawingml/2006/picture">
-                  <pic:nvPicPr>
-                    <pic:cNvPr id="24" name="Image18" descr=""/>
-                    <pic:cNvPicPr>
-                      <a:picLocks noChangeAspect="1" noChangeArrowheads="1"/>
-                    </pic:cNvPicPr>
-                  </pic:nvPicPr>
-                  <pic:blipFill>
-                    <a:blip r:embed="rId25"/>
-                    <a:stretch>
-                      <a:fillRect/>
-                    </a:stretch>
-                  </pic:blipFill>
-                  <pic:spPr bwMode="auto">
-                    <a:xfrm>
-                      <a:off x="0" y="0"/>
-                      <a:ext cx="6179820" cy="2550160"/>
-                    </a:xfrm>
-                    <a:prstGeom prst="rect">
-                      <a:avLst/>
-                    </a:prstGeom>
-                  </pic:spPr>
-                </pic:pic>
-              </a:graphicData>
-            </a:graphic>
-          </wp:anchor>
-        </w:drawing>
-      </w:r>
-    </w:p>
-    <w:p>
-      <w:pPr>
-        <w:pStyle w:val="Normal"/>
-        <w:pBdr>
-          <w:top w:val="single" w:sz="2" w:space="0" w:color="CCCCCC"/>
-          <w:bottom w:val="single" w:sz="2" w:space="0" w:color="CCCCCC"/>
-        </w:pBdr>
-        <w:spacing w:before="200" w:after="100"/>
-        <w:jc w:val="center"/>
-        <w:rPr/>
-      </w:pPr>
-      <w:r>
-        <w:rPr>
-          <w:i/>
-          <w:iCs/>
-          <w:color w:val="555555"/>
-          <w:sz w:val="22"/>
-          <w:szCs w:val="22"/>
-        </w:rPr>
-        <w:t>[Figure 5.12: Workspace Settings]</w:t>
-      </w:r>
-    </w:p>
-    <w:p>
-      <w:pPr>
-        <w:pStyle w:val="Normal"/>
-        <w:pBdr>
-          <w:top w:val="single" w:sz="2" w:space="0" w:color="CCCCCC"/>
-          <w:bottom w:val="single" w:sz="2" w:space="0" w:color="CCCCCC"/>
-        </w:pBdr>
-        <w:spacing w:before="200" w:after="100"/>
-        <w:jc w:val="center"/>
-        <w:rPr>
-          <w:i/>
-          <w:i/>
-          <w:iCs/>
-          <w:color w:val="555555"/>
-          <w:sz w:val="22"/>
-          <w:szCs w:val="22"/>
-        </w:rPr>
-      </w:pPr>
-      <w:r>
-        <w:rPr>
-          <w:i/>
-          <w:iCs/>
-          <w:color w:val="555555"/>
-          <w:sz w:val="22"/>
-          <w:szCs w:val="22"/>
-        </w:rPr>
-      </w:r>
-    </w:p>
-    <w:p>
-      <w:pPr>
-        <w:pStyle w:val="Normal"/>
-        <w:pBdr>
-          <w:top w:val="single" w:sz="2" w:space="0" w:color="CCCCCC"/>
-          <w:bottom w:val="single" w:sz="2" w:space="0" w:color="CCCCCC"/>
-        </w:pBdr>
-        <w:spacing w:before="200" w:after="100"/>
-        <w:jc w:val="center"/>
-        <w:rPr>
-          <w:i/>
-          <w:i/>
-          <w:iCs/>
-          <w:color w:val="555555"/>
-          <w:sz w:val="22"/>
-          <w:szCs w:val="22"/>
-        </w:rPr>
-      </w:pPr>
-      <w:r>
-        <w:rPr>
-          <w:i/>
-          <w:iCs/>
-          <w:color w:val="555555"/>
-          <w:sz w:val="22"/>
-          <w:szCs w:val="22"/>
-        </w:rPr>
-      </w:r>
-    </w:p>
-    <w:p>
-      <w:pPr>
-        <w:pStyle w:val="Normal"/>
-        <w:pBdr>
-          <w:top w:val="single" w:sz="2" w:space="0" w:color="CCCCCC"/>
-          <w:bottom w:val="single" w:sz="2" w:space="0" w:color="CCCCCC"/>
-        </w:pBdr>
-        <w:spacing w:before="200" w:after="100"/>
-        <w:jc w:val="center"/>
-        <w:rPr>
-          <w:i/>
-          <w:i/>
-          <w:iCs/>
-          <w:color w:val="555555"/>
-          <w:sz w:val="22"/>
-          <w:szCs w:val="22"/>
-        </w:rPr>
-      </w:pPr>
-      <w:r>
-        <w:rPr>
-          <w:i/>
-          <w:iCs/>
-          <w:color w:val="555555"/>
-          <w:sz w:val="22"/>
-          <w:szCs w:val="22"/>
-        </w:rPr>
-        <w:drawing>
-          <wp:anchor behindDoc="0" distT="0" distB="0" distL="0" distR="0" simplePos="0" locked="0" layoutInCell="0" allowOverlap="1" relativeHeight="20">
-            <wp:simplePos x="0" y="0"/>
-            <wp:positionH relativeFrom="column">
-              <wp:align>center</wp:align>
-            </wp:positionH>
-            <wp:positionV relativeFrom="paragraph">
-              <wp:posOffset>635</wp:posOffset>
-            </wp:positionV>
-            <wp:extent cx="6070600" cy="2505075"/>
-            <wp:effectExtent l="0" t="0" r="0" b="0"/>
-            <wp:wrapSquare wrapText="largest"/>
-            <wp:docPr id="25" name="Image19" descr=""/>
-            <wp:cNvGraphicFramePr>
-              <a:graphicFrameLocks xmlns:a="http://schemas.openxmlformats.org/drawingml/2006/main" noChangeAspect="1"/>
-            </wp:cNvGraphicFramePr>
-            <a:graphic xmlns:a="http://schemas.openxmlformats.org/drawingml/2006/main">
-              <a:graphicData uri="http://schemas.openxmlformats.org/drawingml/2006/picture">
-                <pic:pic xmlns:pic="http://schemas.openxmlformats.org/drawingml/2006/picture">
-                  <pic:nvPicPr>
-                    <pic:cNvPr id="25" name="Image19" descr=""/>
+                    <pic:cNvPr id="25" name="Image17" descr=""/>
                     <pic:cNvPicPr>
                       <a:picLocks noChangeAspect="1" noChangeArrowheads="1"/>
                     </pic:cNvPicPr>
@@ -16374,7 +16542,7 @@
                   <pic:spPr bwMode="auto">
                     <a:xfrm>
                       <a:off x="0" y="0"/>
-                      <a:ext cx="6070600" cy="2505075"/>
+                      <a:ext cx="6137910" cy="2864485"/>
                     </a:xfrm>
                     <a:prstGeom prst="rect">
                       <a:avLst/>
@@ -16396,23 +16564,17 @@
         </w:pBdr>
         <w:spacing w:before="200" w:after="100"/>
         <w:jc w:val="center"/>
-        <w:rPr>
-          <w:i/>
+        <w:rPr/>
+      </w:pPr>
+      <w:r>
+        <w:rPr>
           <w:i/>
           <w:iCs/>
           <w:color w:val="555555"/>
           <w:sz w:val="22"/>
           <w:szCs w:val="22"/>
         </w:rPr>
-      </w:pPr>
-      <w:r>
-        <w:rPr>
-          <w:i/>
-          <w:iCs/>
-          <w:color w:val="555555"/>
-          <w:sz w:val="22"/>
-          <w:szCs w:val="22"/>
-        </w:rPr>
+        <w:t>[Figure 5.13: Custom Topic]</w:t>
       </w:r>
     </w:p>
     <w:p>
@@ -16424,17 +16586,409 @@
         </w:pBdr>
         <w:spacing w:before="200" w:after="100"/>
         <w:jc w:val="center"/>
-        <w:rPr/>
-      </w:pPr>
-      <w:r>
-        <w:rPr>
+        <w:rPr>
+          <w:i/>
           <w:i/>
           <w:iCs/>
           <w:color w:val="555555"/>
           <w:sz w:val="22"/>
           <w:szCs w:val="22"/>
         </w:rPr>
-        <w:t>[Figure 5.13: Forgot Password]</w:t>
+      </w:pPr>
+      <w:r>
+        <w:rPr>
+          <w:i/>
+          <w:iCs/>
+          <w:color w:val="555555"/>
+          <w:sz w:val="22"/>
+          <w:szCs w:val="22"/>
+        </w:rPr>
+      </w:r>
+    </w:p>
+    <w:p>
+      <w:pPr>
+        <w:pStyle w:val="Normal"/>
+        <w:pBdr>
+          <w:top w:val="single" w:sz="2" w:space="0" w:color="CCCCCC"/>
+          <w:bottom w:val="single" w:sz="2" w:space="0" w:color="CCCCCC"/>
+        </w:pBdr>
+        <w:spacing w:before="200" w:after="100"/>
+        <w:jc w:val="center"/>
+        <w:rPr>
+          <w:i/>
+          <w:i/>
+          <w:iCs/>
+          <w:color w:val="555555"/>
+          <w:sz w:val="22"/>
+          <w:szCs w:val="22"/>
+        </w:rPr>
+      </w:pPr>
+      <w:r>
+        <w:rPr>
+          <w:i/>
+          <w:iCs/>
+          <w:color w:val="555555"/>
+          <w:sz w:val="22"/>
+          <w:szCs w:val="22"/>
+        </w:rPr>
+      </w:r>
+    </w:p>
+    <w:p>
+      <w:pPr>
+        <w:pStyle w:val="Normal"/>
+        <w:pBdr>
+          <w:top w:val="single" w:sz="2" w:space="0" w:color="CCCCCC"/>
+          <w:bottom w:val="single" w:sz="2" w:space="0" w:color="CCCCCC"/>
+        </w:pBdr>
+        <w:spacing w:before="200" w:after="100"/>
+        <w:jc w:val="center"/>
+        <w:rPr>
+          <w:i/>
+          <w:i/>
+          <w:iCs/>
+          <w:color w:val="555555"/>
+          <w:sz w:val="22"/>
+          <w:szCs w:val="22"/>
+        </w:rPr>
+      </w:pPr>
+      <w:r>
+        <w:rPr>
+          <w:i/>
+          <w:iCs/>
+          <w:color w:val="555555"/>
+          <w:sz w:val="22"/>
+          <w:szCs w:val="22"/>
+        </w:rPr>
+      </w:r>
+    </w:p>
+    <w:p>
+      <w:pPr>
+        <w:pStyle w:val="Normal"/>
+        <w:pBdr>
+          <w:top w:val="single" w:sz="2" w:space="0" w:color="CCCCCC"/>
+          <w:bottom w:val="single" w:sz="2" w:space="0" w:color="CCCCCC"/>
+        </w:pBdr>
+        <w:spacing w:before="200" w:after="100"/>
+        <w:jc w:val="center"/>
+        <w:rPr>
+          <w:i/>
+          <w:i/>
+          <w:iCs/>
+          <w:color w:val="555555"/>
+          <w:sz w:val="22"/>
+          <w:szCs w:val="22"/>
+        </w:rPr>
+      </w:pPr>
+      <w:r>
+        <w:rPr>
+          <w:i/>
+          <w:iCs/>
+          <w:color w:val="555555"/>
+          <w:sz w:val="22"/>
+          <w:szCs w:val="22"/>
+        </w:rPr>
+        <w:drawing>
+          <wp:anchor behindDoc="0" distT="0" distB="0" distL="0" distR="0" simplePos="0" locked="0" layoutInCell="0" allowOverlap="1" relativeHeight="29">
+            <wp:simplePos x="0" y="0"/>
+            <wp:positionH relativeFrom="column">
+              <wp:align>center</wp:align>
+            </wp:positionH>
+            <wp:positionV relativeFrom="paragraph">
+              <wp:posOffset>635</wp:posOffset>
+            </wp:positionV>
+            <wp:extent cx="6201410" cy="2905125"/>
+            <wp:effectExtent l="0" t="0" r="0" b="0"/>
+            <wp:wrapSquare wrapText="largest"/>
+            <wp:docPr id="26" name="Image18" descr=""/>
+            <wp:cNvGraphicFramePr>
+              <a:graphicFrameLocks xmlns:a="http://schemas.openxmlformats.org/drawingml/2006/main" noChangeAspect="1"/>
+            </wp:cNvGraphicFramePr>
+            <a:graphic xmlns:a="http://schemas.openxmlformats.org/drawingml/2006/main">
+              <a:graphicData uri="http://schemas.openxmlformats.org/drawingml/2006/picture">
+                <pic:pic xmlns:pic="http://schemas.openxmlformats.org/drawingml/2006/picture">
+                  <pic:nvPicPr>
+                    <pic:cNvPr id="26" name="Image18" descr=""/>
+                    <pic:cNvPicPr>
+                      <a:picLocks noChangeAspect="1" noChangeArrowheads="1"/>
+                    </pic:cNvPicPr>
+                  </pic:nvPicPr>
+                  <pic:blipFill>
+                    <a:blip r:embed="rId27"/>
+                    <a:stretch>
+                      <a:fillRect/>
+                    </a:stretch>
+                  </pic:blipFill>
+                  <pic:spPr bwMode="auto">
+                    <a:xfrm>
+                      <a:off x="0" y="0"/>
+                      <a:ext cx="6201410" cy="2905125"/>
+                    </a:xfrm>
+                    <a:prstGeom prst="rect">
+                      <a:avLst/>
+                    </a:prstGeom>
+                  </pic:spPr>
+                </pic:pic>
+              </a:graphicData>
+            </a:graphic>
+          </wp:anchor>
+        </w:drawing>
+      </w:r>
+    </w:p>
+    <w:p>
+      <w:pPr>
+        <w:pStyle w:val="Normal"/>
+        <w:pBdr>
+          <w:top w:val="single" w:sz="2" w:space="0" w:color="CCCCCC"/>
+          <w:bottom w:val="single" w:sz="2" w:space="0" w:color="CCCCCC"/>
+        </w:pBdr>
+        <w:spacing w:before="200" w:after="100"/>
+        <w:jc w:val="center"/>
+        <w:rPr>
+          <w:i/>
+          <w:i/>
+          <w:iCs/>
+          <w:color w:val="555555"/>
+          <w:sz w:val="22"/>
+          <w:szCs w:val="22"/>
+        </w:rPr>
+      </w:pPr>
+      <w:r>
+        <w:rPr>
+          <w:i/>
+          <w:iCs/>
+          <w:color w:val="555555"/>
+          <w:sz w:val="22"/>
+          <w:szCs w:val="22"/>
+        </w:rPr>
+      </w:r>
+    </w:p>
+    <w:p>
+      <w:pPr>
+        <w:pStyle w:val="Normal"/>
+        <w:pBdr>
+          <w:top w:val="single" w:sz="2" w:space="0" w:color="CCCCCC"/>
+          <w:bottom w:val="single" w:sz="2" w:space="0" w:color="CCCCCC"/>
+        </w:pBdr>
+        <w:spacing w:before="200" w:after="100"/>
+        <w:jc w:val="center"/>
+        <w:rPr>
+          <w:i/>
+          <w:i/>
+          <w:iCs/>
+          <w:color w:val="555555"/>
+          <w:sz w:val="22"/>
+          <w:szCs w:val="22"/>
+        </w:rPr>
+      </w:pPr>
+      <w:r>
+        <w:rPr>
+          <w:i/>
+          <w:iCs/>
+          <w:color w:val="555555"/>
+          <w:sz w:val="22"/>
+          <w:szCs w:val="22"/>
+        </w:rPr>
+      </w:r>
+    </w:p>
+    <w:p>
+      <w:pPr>
+        <w:pStyle w:val="Normal"/>
+        <w:pBdr>
+          <w:top w:val="single" w:sz="2" w:space="0" w:color="CCCCCC"/>
+          <w:bottom w:val="single" w:sz="2" w:space="0" w:color="CCCCCC"/>
+        </w:pBdr>
+        <w:spacing w:before="200" w:after="100"/>
+        <w:jc w:val="center"/>
+        <w:rPr/>
+      </w:pPr>
+      <w:r>
+        <w:rPr>
+          <w:i/>
+          <w:iCs/>
+          <w:color w:val="555555"/>
+          <w:sz w:val="22"/>
+          <w:szCs w:val="22"/>
+        </w:rPr>
+        <w:t>[Figure 5.14: Workspace Settings]</w:t>
+      </w:r>
+    </w:p>
+    <w:p>
+      <w:pPr>
+        <w:pStyle w:val="Normal"/>
+        <w:pBdr>
+          <w:top w:val="single" w:sz="2" w:space="0" w:color="CCCCCC"/>
+          <w:bottom w:val="single" w:sz="2" w:space="0" w:color="CCCCCC"/>
+        </w:pBdr>
+        <w:spacing w:before="200" w:after="100"/>
+        <w:jc w:val="center"/>
+        <w:rPr>
+          <w:i/>
+          <w:i/>
+          <w:iCs/>
+          <w:color w:val="555555"/>
+          <w:sz w:val="22"/>
+          <w:szCs w:val="22"/>
+        </w:rPr>
+      </w:pPr>
+      <w:r>
+        <w:rPr>
+          <w:i/>
+          <w:iCs/>
+          <w:color w:val="555555"/>
+          <w:sz w:val="22"/>
+          <w:szCs w:val="22"/>
+        </w:rPr>
+      </w:r>
+    </w:p>
+    <w:p>
+      <w:pPr>
+        <w:pStyle w:val="Normal"/>
+        <w:pBdr>
+          <w:top w:val="single" w:sz="2" w:space="0" w:color="CCCCCC"/>
+          <w:bottom w:val="single" w:sz="2" w:space="0" w:color="CCCCCC"/>
+        </w:pBdr>
+        <w:spacing w:before="200" w:after="100"/>
+        <w:jc w:val="center"/>
+        <w:rPr>
+          <w:i/>
+          <w:i/>
+          <w:iCs/>
+          <w:color w:val="555555"/>
+          <w:sz w:val="22"/>
+          <w:szCs w:val="22"/>
+        </w:rPr>
+      </w:pPr>
+      <w:r>
+        <w:rPr>
+          <w:i/>
+          <w:iCs/>
+          <w:color w:val="555555"/>
+          <w:sz w:val="22"/>
+          <w:szCs w:val="22"/>
+        </w:rPr>
+        <w:drawing>
+          <wp:anchor behindDoc="0" distT="0" distB="0" distL="0" distR="0" simplePos="0" locked="0" layoutInCell="0" allowOverlap="1" relativeHeight="13">
+            <wp:simplePos x="0" y="0"/>
+            <wp:positionH relativeFrom="column">
+              <wp:posOffset>-517525</wp:posOffset>
+            </wp:positionH>
+            <wp:positionV relativeFrom="paragraph">
+              <wp:posOffset>100965</wp:posOffset>
+            </wp:positionV>
+            <wp:extent cx="6377940" cy="2632075"/>
+            <wp:effectExtent l="0" t="0" r="0" b="0"/>
+            <wp:wrapSquare wrapText="largest"/>
+            <wp:docPr id="27" name="Image19" descr=""/>
+            <wp:cNvGraphicFramePr>
+              <a:graphicFrameLocks xmlns:a="http://schemas.openxmlformats.org/drawingml/2006/main" noChangeAspect="1"/>
+            </wp:cNvGraphicFramePr>
+            <a:graphic xmlns:a="http://schemas.openxmlformats.org/drawingml/2006/main">
+              <a:graphicData uri="http://schemas.openxmlformats.org/drawingml/2006/picture">
+                <pic:pic xmlns:pic="http://schemas.openxmlformats.org/drawingml/2006/picture">
+                  <pic:nvPicPr>
+                    <pic:cNvPr id="27" name="Image19" descr=""/>
+                    <pic:cNvPicPr>
+                      <a:picLocks noChangeAspect="1" noChangeArrowheads="1"/>
+                    </pic:cNvPicPr>
+                  </pic:nvPicPr>
+                  <pic:blipFill>
+                    <a:blip r:embed="rId28"/>
+                    <a:stretch>
+                      <a:fillRect/>
+                    </a:stretch>
+                  </pic:blipFill>
+                  <pic:spPr bwMode="auto">
+                    <a:xfrm>
+                      <a:off x="0" y="0"/>
+                      <a:ext cx="6377940" cy="2632075"/>
+                    </a:xfrm>
+                    <a:prstGeom prst="rect">
+                      <a:avLst/>
+                    </a:prstGeom>
+                  </pic:spPr>
+                </pic:pic>
+              </a:graphicData>
+            </a:graphic>
+          </wp:anchor>
+        </w:drawing>
+      </w:r>
+    </w:p>
+    <w:p>
+      <w:pPr>
+        <w:pStyle w:val="Normal"/>
+        <w:pBdr>
+          <w:top w:val="single" w:sz="2" w:space="0" w:color="CCCCCC"/>
+          <w:bottom w:val="single" w:sz="2" w:space="0" w:color="CCCCCC"/>
+        </w:pBdr>
+        <w:spacing w:before="200" w:after="100"/>
+        <w:jc w:val="center"/>
+        <w:rPr>
+          <w:i/>
+          <w:i/>
+          <w:iCs/>
+          <w:color w:val="555555"/>
+          <w:sz w:val="22"/>
+          <w:szCs w:val="22"/>
+        </w:rPr>
+      </w:pPr>
+      <w:r>
+        <w:rPr>
+          <w:i/>
+          <w:iCs/>
+          <w:color w:val="555555"/>
+          <w:sz w:val="22"/>
+          <w:szCs w:val="22"/>
+        </w:rPr>
+      </w:r>
+    </w:p>
+    <w:p>
+      <w:pPr>
+        <w:pStyle w:val="Normal"/>
+        <w:pBdr>
+          <w:top w:val="single" w:sz="2" w:space="0" w:color="CCCCCC"/>
+          <w:bottom w:val="single" w:sz="2" w:space="0" w:color="CCCCCC"/>
+        </w:pBdr>
+        <w:spacing w:before="200" w:after="100"/>
+        <w:jc w:val="center"/>
+        <w:rPr>
+          <w:i/>
+          <w:i/>
+          <w:iCs/>
+          <w:color w:val="555555"/>
+          <w:sz w:val="22"/>
+          <w:szCs w:val="22"/>
+        </w:rPr>
+      </w:pPr>
+      <w:r>
+        <w:rPr>
+          <w:i/>
+          <w:iCs/>
+          <w:color w:val="555555"/>
+          <w:sz w:val="22"/>
+          <w:szCs w:val="22"/>
+        </w:rPr>
+      </w:r>
+    </w:p>
+    <w:p>
+      <w:pPr>
+        <w:pStyle w:val="Normal"/>
+        <w:pBdr>
+          <w:top w:val="single" w:sz="2" w:space="0" w:color="CCCCCC"/>
+          <w:bottom w:val="single" w:sz="2" w:space="0" w:color="CCCCCC"/>
+        </w:pBdr>
+        <w:spacing w:before="200" w:after="100"/>
+        <w:jc w:val="center"/>
+        <w:rPr/>
+      </w:pPr>
+      <w:r>
+        <w:rPr>
+          <w:i/>
+          <w:iCs/>
+          <w:color w:val="555555"/>
+          <w:sz w:val="22"/>
+          <w:szCs w:val="22"/>
+        </w:rPr>
+        <w:t>[Figure 5.15: Forgot Password]</w:t>
       </w:r>
     </w:p>
     <w:p>
@@ -16505,7 +17059,7 @@
           <w:szCs w:val="28"/>
         </w:rPr>
         <w:drawing>
-          <wp:anchor behindDoc="0" distT="0" distB="0" distL="0" distR="0" simplePos="0" locked="0" layoutInCell="0" allowOverlap="1" relativeHeight="22">
+          <wp:anchor behindDoc="0" distT="0" distB="0" distL="0" distR="0" simplePos="0" locked="0" layoutInCell="0" allowOverlap="1" relativeHeight="15">
             <wp:simplePos x="0" y="0"/>
             <wp:positionH relativeFrom="column">
               <wp:posOffset>-454025</wp:posOffset>
@@ -16516,7 +17070,7 @@
             <wp:extent cx="6332220" cy="2626360"/>
             <wp:effectExtent l="0" t="0" r="0" b="0"/>
             <wp:wrapSquare wrapText="largest"/>
-            <wp:docPr id="26" name="Image20" descr=""/>
+            <wp:docPr id="28" name="Image20" descr=""/>
             <wp:cNvGraphicFramePr>
               <a:graphicFrameLocks xmlns:a="http://schemas.openxmlformats.org/drawingml/2006/main" noChangeAspect="1"/>
             </wp:cNvGraphicFramePr>
@@ -16524,13 +17078,13 @@
               <a:graphicData uri="http://schemas.openxmlformats.org/drawingml/2006/picture">
                 <pic:pic xmlns:pic="http://schemas.openxmlformats.org/drawingml/2006/picture">
                   <pic:nvPicPr>
-                    <pic:cNvPr id="26" name="Image20" descr=""/>
+                    <pic:cNvPr id="28" name="Image20" descr=""/>
                     <pic:cNvPicPr>
                       <a:picLocks noChangeAspect="1" noChangeArrowheads="1"/>
                     </pic:cNvPicPr>
                   </pic:nvPicPr>
                   <pic:blipFill>
-                    <a:blip r:embed="rId27"/>
+                    <a:blip r:embed="rId29"/>
                     <a:stretch>
                       <a:fillRect/>
                     </a:stretch>
@@ -16575,7 +17129,7 @@
           <w:szCs w:val="22"/>
         </w:rPr>
         <w:br/>
-        <w:t>[Figure 5.13: Admin Login ]</w:t>
+        <w:t>[Figure 5.16: Admin Login ]</w:t>
       </w:r>
     </w:p>
     <w:p>
@@ -16593,6 +17147,123 @@
           <w:sz w:val="28"/>
           <w:szCs w:val="28"/>
         </w:rPr>
+        <w:drawing>
+          <wp:anchor behindDoc="0" distT="0" distB="0" distL="0" distR="0" simplePos="0" locked="0" layoutInCell="0" allowOverlap="1" relativeHeight="30">
+            <wp:simplePos x="0" y="0"/>
+            <wp:positionH relativeFrom="column">
+              <wp:posOffset>-316230</wp:posOffset>
+            </wp:positionH>
+            <wp:positionV relativeFrom="paragraph">
+              <wp:posOffset>476250</wp:posOffset>
+            </wp:positionV>
+            <wp:extent cx="6128385" cy="2541905"/>
+            <wp:effectExtent l="0" t="0" r="0" b="0"/>
+            <wp:wrapSquare wrapText="largest"/>
+            <wp:docPr id="29" name="Image27" descr=""/>
+            <wp:cNvGraphicFramePr>
+              <a:graphicFrameLocks xmlns:a="http://schemas.openxmlformats.org/drawingml/2006/main" noChangeAspect="1"/>
+            </wp:cNvGraphicFramePr>
+            <a:graphic xmlns:a="http://schemas.openxmlformats.org/drawingml/2006/main">
+              <a:graphicData uri="http://schemas.openxmlformats.org/drawingml/2006/picture">
+                <pic:pic xmlns:pic="http://schemas.openxmlformats.org/drawingml/2006/picture">
+                  <pic:nvPicPr>
+                    <pic:cNvPr id="29" name="Image27" descr=""/>
+                    <pic:cNvPicPr>
+                      <a:picLocks noChangeAspect="1" noChangeArrowheads="1"/>
+                    </pic:cNvPicPr>
+                  </pic:nvPicPr>
+                  <pic:blipFill>
+                    <a:blip r:embed="rId30"/>
+                    <a:stretch>
+                      <a:fillRect/>
+                    </a:stretch>
+                  </pic:blipFill>
+                  <pic:spPr bwMode="auto">
+                    <a:xfrm>
+                      <a:off x="0" y="0"/>
+                      <a:ext cx="6128385" cy="2541905"/>
+                    </a:xfrm>
+                    <a:prstGeom prst="rect">
+                      <a:avLst/>
+                    </a:prstGeom>
+                  </pic:spPr>
+                </pic:pic>
+              </a:graphicData>
+            </a:graphic>
+          </wp:anchor>
+        </w:drawing>
+      </w:r>
+    </w:p>
+    <w:p>
+      <w:pPr>
+        <w:pStyle w:val="Normal"/>
+        <w:pBdr>
+          <w:top w:val="single" w:sz="2" w:space="0" w:color="CCCCCC"/>
+          <w:bottom w:val="single" w:sz="2" w:space="0" w:color="CCCCCC"/>
+        </w:pBdr>
+        <w:spacing w:before="200" w:after="100"/>
+        <w:jc w:val="center"/>
+        <w:rPr>
+          <w:color w:val="000000" w:themeColor="text1"/>
+          <w:sz w:val="28"/>
+          <w:szCs w:val="28"/>
+        </w:rPr>
+      </w:pPr>
+      <w:r>
+        <w:rPr>
+          <w:color w:val="000000" w:themeColor="text1"/>
+          <w:sz w:val="28"/>
+          <w:szCs w:val="28"/>
+        </w:rPr>
+      </w:r>
+    </w:p>
+    <w:p>
+      <w:pPr>
+        <w:pStyle w:val="Normal"/>
+        <w:pBdr>
+          <w:top w:val="single" w:sz="2" w:space="0" w:color="CCCCCC"/>
+          <w:bottom w:val="single" w:sz="2" w:space="0" w:color="CCCCCC"/>
+        </w:pBdr>
+        <w:spacing w:before="200" w:after="100"/>
+        <w:jc w:val="center"/>
+        <w:rPr>
+          <w:color w:val="000000" w:themeColor="text1"/>
+          <w:sz w:val="28"/>
+          <w:szCs w:val="28"/>
+        </w:rPr>
+      </w:pPr>
+      <w:r>
+        <w:rPr>
+          <w:i/>
+          <w:iCs/>
+          <w:color w:val="555555" w:themeColor="text1"/>
+          <w:sz w:val="22"/>
+          <w:szCs w:val="22"/>
+        </w:rPr>
+        <w:t>[Figure 5.17: Admin Dashboard ]</w:t>
+      </w:r>
+    </w:p>
+    <w:p>
+      <w:pPr>
+        <w:pStyle w:val="Normal"/>
+        <w:pBdr>
+          <w:top w:val="single" w:sz="2" w:space="0" w:color="CCCCCC"/>
+          <w:bottom w:val="single" w:sz="2" w:space="0" w:color="CCCCCC"/>
+        </w:pBdr>
+        <w:spacing w:before="200" w:after="100"/>
+        <w:jc w:val="center"/>
+        <w:rPr>
+          <w:color w:val="000000" w:themeColor="text1"/>
+          <w:sz w:val="28"/>
+          <w:szCs w:val="28"/>
+        </w:rPr>
+      </w:pPr>
+      <w:r>
+        <w:rPr>
+          <w:color w:val="000000" w:themeColor="text1"/>
+          <w:sz w:val="28"/>
+          <w:szCs w:val="28"/>
+        </w:rPr>
       </w:r>
     </w:p>
     <w:p>
@@ -16610,8 +17281,42 @@
           <w:sz w:val="28"/>
           <w:szCs w:val="28"/>
         </w:rPr>
+      </w:r>
+    </w:p>
+    <w:p>
+      <w:pPr>
+        <w:pStyle w:val="Heading2"/>
+        <w:rPr>
+          <w:color w:val="000000" w:themeColor="text1"/>
+          <w:sz w:val="28"/>
+          <w:szCs w:val="28"/>
+        </w:rPr>
+      </w:pPr>
+      <w:r>
+        <w:rPr>
+          <w:color w:val="000000" w:themeColor="text1"/>
+          <w:sz w:val="28"/>
+          <w:szCs w:val="28"/>
+        </w:rPr>
+      </w:r>
+    </w:p>
+    <w:p>
+      <w:pPr>
+        <w:pStyle w:val="Heading2"/>
+        <w:rPr>
+          <w:color w:val="000000" w:themeColor="text1"/>
+          <w:sz w:val="28"/>
+          <w:szCs w:val="28"/>
+        </w:rPr>
+      </w:pPr>
+      <w:r>
+        <w:rPr>
+          <w:color w:val="000000" w:themeColor="text1"/>
+          <w:sz w:val="28"/>
+          <w:szCs w:val="28"/>
+        </w:rPr>
         <w:drawing>
-          <wp:anchor behindDoc="0" distT="0" distB="0" distL="0" distR="0" simplePos="0" locked="0" layoutInCell="0" allowOverlap="1" relativeHeight="28">
+          <wp:anchor behindDoc="0" distT="0" distB="0" distL="0" distR="0" simplePos="0" locked="0" layoutInCell="0" allowOverlap="1" relativeHeight="21">
             <wp:simplePos x="0" y="0"/>
             <wp:positionH relativeFrom="column">
               <wp:posOffset>-421005</wp:posOffset>
@@ -16622,7 +17327,7 @@
             <wp:extent cx="6280785" cy="2605405"/>
             <wp:effectExtent l="0" t="0" r="0" b="0"/>
             <wp:wrapSquare wrapText="largest"/>
-            <wp:docPr id="27" name="Image25" descr=""/>
+            <wp:docPr id="30" name="Image25" descr=""/>
             <wp:cNvGraphicFramePr>
               <a:graphicFrameLocks xmlns:a="http://schemas.openxmlformats.org/drawingml/2006/main" noChangeAspect="1"/>
             </wp:cNvGraphicFramePr>
@@ -16630,13 +17335,13 @@
               <a:graphicData uri="http://schemas.openxmlformats.org/drawingml/2006/picture">
                 <pic:pic xmlns:pic="http://schemas.openxmlformats.org/drawingml/2006/picture">
                   <pic:nvPicPr>
-                    <pic:cNvPr id="27" name="Image25" descr=""/>
+                    <pic:cNvPr id="30" name="Image25" descr=""/>
                     <pic:cNvPicPr>
                       <a:picLocks noChangeAspect="1" noChangeArrowheads="1"/>
                     </pic:cNvPicPr>
                   </pic:nvPicPr>
                   <pic:blipFill>
-                    <a:blip r:embed="rId28"/>
+                    <a:blip r:embed="rId31"/>
                     <a:stretch>
                       <a:fillRect/>
                     </a:stretch>
@@ -16680,7 +17385,126 @@
           <w:sz w:val="22"/>
           <w:szCs w:val="22"/>
         </w:rPr>
-        <w:t>[Figure 5.14: Mange Prompt Templates]</w:t>
+        <w:t>[Figure 5.18: Mange Prompt Templates]</w:t>
+      </w:r>
+    </w:p>
+    <w:p>
+      <w:pPr>
+        <w:pStyle w:val="Heading2"/>
+        <w:rPr>
+          <w:color w:val="000000" w:themeColor="text1"/>
+          <w:sz w:val="28"/>
+          <w:szCs w:val="28"/>
+        </w:rPr>
+      </w:pPr>
+      <w:r>
+        <w:rPr>
+          <w:color w:val="000000" w:themeColor="text1"/>
+          <w:sz w:val="28"/>
+          <w:szCs w:val="28"/>
+        </w:rPr>
+      </w:r>
+    </w:p>
+    <w:p>
+      <w:pPr>
+        <w:pStyle w:val="Heading2"/>
+        <w:rPr>
+          <w:color w:val="000000" w:themeColor="text1"/>
+          <w:sz w:val="28"/>
+          <w:szCs w:val="28"/>
+        </w:rPr>
+      </w:pPr>
+      <w:r>
+        <w:rPr>
+          <w:color w:val="000000" w:themeColor="text1"/>
+          <w:sz w:val="28"/>
+          <w:szCs w:val="28"/>
+        </w:rPr>
+      </w:r>
+    </w:p>
+    <w:p>
+      <w:pPr>
+        <w:pStyle w:val="Heading2"/>
+        <w:rPr>
+          <w:color w:val="000000" w:themeColor="text1"/>
+          <w:sz w:val="28"/>
+          <w:szCs w:val="28"/>
+        </w:rPr>
+      </w:pPr>
+      <w:r>
+        <w:rPr>
+          <w:color w:val="000000" w:themeColor="text1"/>
+          <w:sz w:val="28"/>
+          <w:szCs w:val="28"/>
+        </w:rPr>
+      </w:r>
+    </w:p>
+    <w:p>
+      <w:pPr>
+        <w:pStyle w:val="Heading2"/>
+        <w:rPr>
+          <w:color w:val="000000" w:themeColor="text1"/>
+          <w:sz w:val="28"/>
+          <w:szCs w:val="28"/>
+        </w:rPr>
+      </w:pPr>
+      <w:r>
+        <w:rPr>
+          <w:color w:val="000000" w:themeColor="text1"/>
+          <w:sz w:val="28"/>
+          <w:szCs w:val="28"/>
+        </w:rPr>
+      </w:r>
+    </w:p>
+    <w:p>
+      <w:pPr>
+        <w:pStyle w:val="Heading2"/>
+        <w:rPr>
+          <w:color w:val="000000" w:themeColor="text1"/>
+          <w:sz w:val="28"/>
+          <w:szCs w:val="28"/>
+        </w:rPr>
+      </w:pPr>
+      <w:r>
+        <w:rPr>
+          <w:color w:val="000000" w:themeColor="text1"/>
+          <w:sz w:val="28"/>
+          <w:szCs w:val="28"/>
+        </w:rPr>
+      </w:r>
+    </w:p>
+    <w:p>
+      <w:pPr>
+        <w:pStyle w:val="Heading2"/>
+        <w:rPr>
+          <w:color w:val="000000" w:themeColor="text1"/>
+          <w:sz w:val="28"/>
+          <w:szCs w:val="28"/>
+        </w:rPr>
+      </w:pPr>
+      <w:r>
+        <w:rPr>
+          <w:color w:val="000000" w:themeColor="text1"/>
+          <w:sz w:val="28"/>
+          <w:szCs w:val="28"/>
+        </w:rPr>
+      </w:r>
+    </w:p>
+    <w:p>
+      <w:pPr>
+        <w:pStyle w:val="Heading2"/>
+        <w:rPr>
+          <w:color w:val="000000" w:themeColor="text1"/>
+          <w:sz w:val="28"/>
+          <w:szCs w:val="28"/>
+        </w:rPr>
+      </w:pPr>
+      <w:r>
+        <w:rPr>
+          <w:color w:val="000000" w:themeColor="text1"/>
+          <w:sz w:val="28"/>
+          <w:szCs w:val="28"/>
+        </w:rPr>
       </w:r>
     </w:p>
     <w:p>
@@ -18640,7 +19464,11 @@
         </w:rPr>
       </w:pPr>
       <w:r>
-        <w:rPr/>
+        <w:rPr>
+          <w:color w:val="000000" w:themeColor="text1"/>
+          <w:sz w:val="28"/>
+          <w:szCs w:val="28"/>
+        </w:rPr>
       </w:r>
     </w:p>
     <w:p>
@@ -18713,16 +19541,7 @@
           <w:sz w:val="32"/>
           <w:szCs w:val="32"/>
         </w:rPr>
-        <w:t>R</w:t>
-      </w:r>
-      <w:r>
-        <w:rPr>
-          <w:b/>
-          <w:bCs/>
-          <w:sz w:val="32"/>
-          <w:szCs w:val="32"/>
-        </w:rPr>
-        <w:t>EFERENCES</w:t>
+        <w:t>REFERENCES</w:t>
       </w:r>
     </w:p>
     <w:p>

</xml_diff>